<commit_message>
fix: complete task nine release verification
</commit_message>
<xml_diff>
--- a/clinical-protocol-poc/fixtures/self-service/synopsis.docx
+++ b/clinical-protocol-poc/fixtures/self-service/synopsis.docx
@@ -2,22 +2,6 @@
 <file path=word/document.xml><?xml version="1.0" encoding="utf-8"?>
 <w:document xmlns:w="http://schemas.openxmlformats.org/wordprocessingml/2006/main" xmlns:r="http://schemas.openxmlformats.org/officeDocument/2006/relationships">
   <w:body>
-    <w:p>
-      <w:pPr>
-        <w:pStyle w:val="POCTitle"/>
-      </w:pPr>
-      <w:r>
-        <w:t>Self-service synthetic study synopsis</w:t>
-      </w:r>
-    </w:p>
-    <w:p>
-      <w:pPr>
-        <w:pStyle w:val="POCDisclaimer"/>
-      </w:pPr>
-      <w:r>
-        <w:t>Synthetic-only evaluation fixture; not for clinical, regulatory, or submission use.</w:t>
-      </w:r>
-    </w:p>
     <w:p>
       <w:pPr>
         <w:pStyle w:val="Heading1"/>

</xml_diff>